<commit_message>
Note de point d'étape : explication simple de chaque tâche sous le tableau des limites
Co-Authored-By: Claude Opus 5.5 <noreply@anthropic.com>
Claude-Session: https://claude.ai/code/session_01QrZoDwZJKb9thfUp96Ro9x
</commit_message>
<xml_diff>
--- a/rapport/FPPN_Note_point_etape_travaux_20261021.docx
+++ b/rapport/FPPN_Note_point_etape_travaux_20261021.docx
@@ -5837,6 +5837,388 @@
     </w:p>
     <w:p>
       <w:pPr>
+        <w:pStyle w:val="Heading2"/>
+      </w:pPr>
+      <w:r>
+        <w:t>2.2. EXPLICATION SIMPLE DE CHAQUE TÂCHE</w:t>
+      </w:r>
+    </w:p>
+    <w:p>
+      <w:pPr/>
+      <w:r>
+        <w:rPr>
+          <w:rFonts w:ascii="Helvetica" w:hAnsi="Helvetica" w:cs="Helvetica" w:eastAsia="Helvetica"/>
+          <w:color w:val="000000"/>
+        </w:rPr>
+        <w:t>Cette section explique chaque ligne du tableau 2 sans vocabulaire technique : ce que veut dire la tâche, ce qui a été trouvé, ce qui manque et pourquoi.</w:t>
+      </w:r>
+    </w:p>
+    <w:p>
+      <w:pPr>
+        <w:pStyle w:val="Heading3"/>
+      </w:pPr>
+      <w:r>
+        <w:t>Tâche 1. Engagements envers les adhérents et leurs ayants droit</w:t>
+      </w:r>
+    </w:p>
+    <w:p>
+      <w:pPr/>
+      <w:r>
+        <w:rPr>
+          <w:rFonts w:ascii="Helvetica" w:hAnsi="Helvetica" w:cs="Helvetica" w:eastAsia="Helvetica"/>
+          <w:b/>
+          <w:color w:val="000000"/>
+        </w:rPr>
+        <w:t>Un engagement est une somme que le FPPN devra payer plus tard à un policier ou à sa famille.</w:t>
+      </w:r>
+      <w:r>
+        <w:rPr>
+          <w:rFonts w:ascii="Helvetica" w:hAnsi="Helvetica" w:cs="Helvetica" w:eastAsia="Helvetica"/>
+          <w:color w:val="000000"/>
+        </w:rPr>
+        <w:t xml:space="preserve"> Il y en a quatre sortes : l'épargne que les policiers ont versée et qu'il faudra leur rendre (PEP et EFC), les allocations décès dues aux familles, les soins déjà reçus mais pas encore payés aux cliniques, et les soins des retraités si le FPPN les a promis à vie.</w:t>
+      </w:r>
+    </w:p>
+    <w:p>
+      <w:pPr/>
+      <w:r>
+        <w:rPr>
+          <w:rFonts w:ascii="Helvetica" w:hAnsi="Helvetica" w:cs="Helvetica" w:eastAsia="Helvetica"/>
+          <w:b/>
+          <w:color w:val="000000"/>
+        </w:rPr>
+        <w:t>Une seule de ces sommes est connue avec certitude : l'épargne due, soit 15 743 516 391 FCFA au 31/08/2026.</w:t>
+      </w:r>
+      <w:r>
+        <w:rPr>
+          <w:rFonts w:ascii="Helvetica" w:hAnsi="Helvetica" w:cs="Helvetica" w:eastAsia="Helvetica"/>
+          <w:color w:val="000000"/>
+        </w:rPr>
+        <w:t xml:space="preserve"> Elle se compose de 5 229 245 425 FCFA pour le PEP et de 10 514 270 966 FCFA pour l'EFC, lus dans la comptabilité.</w:t>
+      </w:r>
+    </w:p>
+    <w:p>
+      <w:pPr/>
+      <w:r>
+        <w:rPr>
+          <w:rFonts w:ascii="Helvetica" w:hAnsi="Helvetica" w:cs="Helvetica" w:eastAsia="Helvetica"/>
+          <w:b/>
+          <w:color w:val="000000"/>
+        </w:rPr>
+        <w:t>Les trois autres ne peuvent pas être chiffrées aujourd'hui.</w:t>
+      </w:r>
+      <w:r>
+        <w:rPr>
+          <w:rFonts w:ascii="Helvetica" w:hAnsi="Helvetica" w:cs="Helvetica" w:eastAsia="Helvetica"/>
+          <w:color w:val="000000"/>
+        </w:rPr>
+        <w:t xml:space="preserve"> Pour les calculer, il faut la liste des dossiers de prestations, l'âge de chaque policier et les règles écrites de chaque produit, qui fixent ce qui est promis. Ces documents n'ont pas été transmis.</w:t>
+      </w:r>
+    </w:p>
+    <w:p>
+      <w:pPr/>
+      <w:r>
+        <w:rPr>
+          <w:rFonts w:ascii="Helvetica" w:hAnsi="Helvetica" w:cs="Helvetica" w:eastAsia="Helvetica"/>
+          <w:b/>
+          <w:color w:val="000000"/>
+        </w:rPr>
+        <w:t>Le total réel des engagements est donc supérieur au chiffre connu.</w:t>
+      </w:r>
+      <w:r>
+        <w:rPr>
+          <w:rFonts w:ascii="Helvetica" w:hAnsi="Helvetica" w:cs="Helvetica" w:eastAsia="Helvetica"/>
+          <w:color w:val="000000"/>
+        </w:rPr>
+        <w:t xml:space="preserve"> C'est comme un ménage qui connaît le montant de son prêt bancaire mais pas celui de ses factures en attente : sa dette réelle est forcément plus grande.</w:t>
+      </w:r>
+    </w:p>
+    <w:p>
+      <w:pPr>
+        <w:pStyle w:val="Heading3"/>
+      </w:pPr>
+      <w:r>
+        <w:t>Tâche 2. Suffisance des provisions</w:t>
+      </w:r>
+    </w:p>
+    <w:p>
+      <w:pPr/>
+      <w:r>
+        <w:rPr>
+          <w:rFonts w:ascii="Helvetica" w:hAnsi="Helvetica" w:cs="Helvetica" w:eastAsia="Helvetica"/>
+          <w:b/>
+          <w:color w:val="000000"/>
+        </w:rPr>
+        <w:t>Une provision est une somme mise de côté dans les comptes pour payer des prestations déjà dues mais pas encore réglées.</w:t>
+      </w:r>
+      <w:r>
+        <w:rPr>
+          <w:rFonts w:ascii="Helvetica" w:hAnsi="Helvetica" w:cs="Helvetica" w:eastAsia="Helvetica"/>
+          <w:color w:val="000000"/>
+        </w:rPr>
+        <w:t xml:space="preserve"> Exemple : un policier hospitalisé en décembre dont la facture n'arrive qu'en février. La dépense appartient à l'année où il a été soigné : le FPPN doit donc réserver l'argent dès décembre. « Suffisante » veut dire que la somme réservée couvre bien tout ce qui reste à payer.</w:t>
+      </w:r>
+    </w:p>
+    <w:p>
+      <w:pPr/>
+      <w:r>
+        <w:rPr>
+          <w:rFonts w:ascii="Helvetica" w:hAnsi="Helvetica" w:cs="Helvetica" w:eastAsia="Helvetica"/>
+          <w:b/>
+          <w:color w:val="000000"/>
+        </w:rPr>
+        <w:t>Au FPPN, la provision vaut 4 829 298 290 FCFA, au franc près, chaque année de 2020 au 31/08/2026.</w:t>
+      </w:r>
+      <w:r>
+        <w:rPr>
+          <w:rFonts w:ascii="Helvetica" w:hAnsi="Helvetica" w:cs="Helvetica" w:eastAsia="Helvetica"/>
+          <w:color w:val="000000"/>
+        </w:rPr>
+        <w:t xml:space="preserve"> Selon le chef comptable, ce montant date d'environ 2004 et n'a jamais été recalculé. Pendant ce temps, les prestations maladie sont passées de 101 453 171 FCFA en 2021 à 1 771 635 361 FCFA en 2025.</w:t>
+      </w:r>
+    </w:p>
+    <w:p>
+      <w:pPr/>
+      <w:r>
+        <w:rPr>
+          <w:rFonts w:ascii="Helvetica" w:hAnsi="Helvetica" w:cs="Helvetica" w:eastAsia="Helvetica"/>
+          <w:b/>
+          <w:color w:val="000000"/>
+        </w:rPr>
+        <w:t>Il n'est pas possible de dire aujourd'hui si cette somme est trop faible ou trop forte.</w:t>
+      </w:r>
+      <w:r>
+        <w:rPr>
+          <w:rFonts w:ascii="Helvetica" w:hAnsi="Helvetica" w:cs="Helvetica" w:eastAsia="Helvetica"/>
+          <w:color w:val="000000"/>
+        </w:rPr>
+        <w:t xml:space="preserve"> Le calcul demande la liste de chaque dossier avec trois dates : celle du soin ou du décès, celle de la déclaration au FPPN et celle du paiement. La méthode est fixée par les textes : un calcul dossier par dossier, plus une estimation des dossiers pas encore déclarés (circulaire CIMA n° 00230/2005). Un montant figé depuis plus de vingt ans ne peut pas, sauf hasard, être le bon.</w:t>
+      </w:r>
+    </w:p>
+    <w:p>
+      <w:pPr>
+        <w:pStyle w:val="Heading3"/>
+      </w:pPr>
+      <w:r>
+        <w:t>Tâche 3. Adossement actif-passif</w:t>
+      </w:r>
+    </w:p>
+    <w:p>
+      <w:pPr/>
+      <w:r>
+        <w:rPr>
+          <w:rFonts w:ascii="Helvetica" w:hAnsi="Helvetica" w:cs="Helvetica" w:eastAsia="Helvetica"/>
+          <w:b/>
+          <w:color w:val="000000"/>
+        </w:rPr>
+        <w:t>L'actif, c'est ce que le FPPN possède. Le passif, c'est ce qu'il doit.</w:t>
+      </w:r>
+      <w:r>
+        <w:rPr>
+          <w:rFonts w:ascii="Helvetica" w:hAnsi="Helvetica" w:cs="Helvetica" w:eastAsia="Helvetica"/>
+          <w:color w:val="000000"/>
+        </w:rPr>
+        <w:t xml:space="preserve"> L'actif comprend l'argent en banque, les placements, les terrains, les prêts consentis aux policiers et les sommes qu'on lui doit. Le passif comprend l'épargne des policiers, les factures à payer et les provisions.</w:t>
+      </w:r>
+    </w:p>
+    <w:p>
+      <w:pPr/>
+      <w:r>
+        <w:rPr>
+          <w:rFonts w:ascii="Helvetica" w:hAnsi="Helvetica" w:cs="Helvetica" w:eastAsia="Helvetica"/>
+          <w:b/>
+          <w:color w:val="000000"/>
+        </w:rPr>
+        <w:t>Adosser, c'est vérifier que chaque dette est couverte par un bien disponible au bon moment et pour le bon montant.</w:t>
+      </w:r>
+      <w:r>
+        <w:rPr>
+          <w:rFonts w:ascii="Helvetica" w:hAnsi="Helvetica" w:cs="Helvetica" w:eastAsia="Helvetica"/>
+          <w:color w:val="000000"/>
+        </w:rPr>
+        <w:t xml:space="preserve"> Exemple : une personne qui doit rembourser 10 millions le mois prochain doit avoir 10 millions en banque le mois prochain. Un terrain qui demandera un an pour être vendu ne l'aide pas à payer à temps.</w:t>
+      </w:r>
+    </w:p>
+    <w:p>
+      <w:pPr/>
+      <w:r>
+        <w:rPr>
+          <w:rFonts w:ascii="Helvetica" w:hAnsi="Helvetica" w:cs="Helvetica" w:eastAsia="Helvetica"/>
+          <w:b/>
+          <w:color w:val="000000"/>
+        </w:rPr>
+        <w:t>Le FPPN n'est pas adossé.</w:t>
+      </w:r>
+      <w:r>
+        <w:rPr>
+          <w:rFonts w:ascii="Helvetica" w:hAnsi="Helvetica" w:cs="Helvetica" w:eastAsia="Helvetica"/>
+          <w:color w:val="000000"/>
+        </w:rPr>
+        <w:t xml:space="preserve"> Les dettes connues atteignent 22 761 252 888 FCFA. En comptant tous les biens à leur valeur dans les comptes, ils couvrent 96,33 % de ces dettes. Sans les biens dont la valeur n'est pas démontrée (créance sur l'hôpital de la Police, clinique, terrains), ils n'en couvrent que 27,19 %. Sur un an, l'argent disponible couvre 49,27 % des dettes à payer dans l'année.</w:t>
+      </w:r>
+    </w:p>
+    <w:p>
+      <w:pPr/>
+      <w:r>
+        <w:rPr>
+          <w:rFonts w:ascii="Helvetica" w:hAnsi="Helvetica" w:cs="Helvetica" w:eastAsia="Helvetica"/>
+          <w:b/>
+          <w:color w:val="000000"/>
+        </w:rPr>
+        <w:t>Ce constat est un minimum : la situation réelle ne peut être que moins bonne.</w:t>
+      </w:r>
+      <w:r>
+        <w:rPr>
+          <w:rFonts w:ascii="Helvetica" w:hAnsi="Helvetica" w:cs="Helvetica" w:eastAsia="Helvetica"/>
+          <w:color w:val="000000"/>
+        </w:rPr>
+        <w:t xml:space="preserve"> Toutes les informations manquantes ajouteraient des dettes (provisions à recalculer) ou retireraient de la valeur aux biens (terrains et clinique non évalués). Ce qui manque pour mesurer l'écart exact : les dates auxquelles les policiers retireront leur épargne, et une évaluation des terrains, de la clinique et de la créance sur l'hôpital.</w:t>
+      </w:r>
+    </w:p>
+    <w:p>
+      <w:pPr>
+        <w:pStyle w:val="Heading3"/>
+      </w:pPr>
+      <w:r>
+        <w:t>Tâche 4. Adéquation des placements</w:t>
+      </w:r>
+    </w:p>
+    <w:p>
+      <w:pPr/>
+      <w:r>
+        <w:rPr>
+          <w:rFonts w:ascii="Helvetica" w:hAnsi="Helvetica" w:cs="Helvetica" w:eastAsia="Helvetica"/>
+          <w:b/>
+          <w:color w:val="000000"/>
+        </w:rPr>
+        <w:t>Un placement est l'endroit où le FPPN met son argent pour qu'il rapporte, par exemple un dépôt à terme en banque ou un fonds de placement.</w:t>
+      </w:r>
+      <w:r>
+        <w:rPr>
+          <w:rFonts w:ascii="Helvetica" w:hAnsi="Helvetica" w:cs="Helvetica" w:eastAsia="Helvetica"/>
+          <w:color w:val="000000"/>
+        </w:rPr>
+        <w:t xml:space="preserve"> Les textes de l'UEMOA exigent quatre qualités : sécurité (ne pas perdre l'argent), rendement (qu'il rapporte), liquidité (pouvoir le récupérer quand il faut payer) et diversification (ne pas tout mettre au même endroit). C'est l'article 17 du règlement d'exécution n° 004/2022.</w:t>
+      </w:r>
+    </w:p>
+    <w:p>
+      <w:pPr/>
+      <w:r>
+        <w:rPr>
+          <w:rFonts w:ascii="Helvetica" w:hAnsi="Helvetica" w:cs="Helvetica" w:eastAsia="Helvetica"/>
+          <w:b/>
+          <w:color w:val="000000"/>
+        </w:rPr>
+        <w:t>Deux qualités manquent clairement : la liquidité et la diversification.</w:t>
+      </w:r>
+      <w:r>
+        <w:rPr>
+          <w:rFonts w:ascii="Helvetica" w:hAnsi="Helvetica" w:cs="Helvetica" w:eastAsia="Helvetica"/>
+          <w:color w:val="000000"/>
+        </w:rPr>
+        <w:t xml:space="preserve"> Les biens réservés à l'épargne ne couvrent que 16,28 % de l'épargne due. Le dépôt à terme principal est vidé chaque fin d'année, et l'argent est concentré sur une banque et un fonds.</w:t>
+      </w:r>
+    </w:p>
+    <w:p>
+      <w:pPr/>
+      <w:r>
+        <w:rPr>
+          <w:rFonts w:ascii="Helvetica" w:hAnsi="Helvetica" w:cs="Helvetica" w:eastAsia="Helvetica"/>
+          <w:b/>
+          <w:color w:val="000000"/>
+        </w:rPr>
+        <w:t>Le rendement est faible : 1,30 % en 2022, 1,28 % en 2023 et 1,73 % en 2024.</w:t>
+      </w:r>
+      <w:r>
+        <w:rPr>
+          <w:rFonts w:ascii="Helvetica" w:hAnsi="Helvetica" w:cs="Helvetica" w:eastAsia="Helvetica"/>
+          <w:color w:val="000000"/>
+        </w:rPr>
+        <w:t xml:space="preserve"> Sur les mêmes années, les obligations de l'État de Côte d'Ivoire à 5 ans rapportaient 5,19 %, 6,86 % et 7,73 %. Or le FPPN promet 3,5 % par an sur l'épargne des policiers.</w:t>
+      </w:r>
+    </w:p>
+    <w:p>
+      <w:pPr/>
+      <w:r>
+        <w:rPr>
+          <w:rFonts w:ascii="Helvetica" w:hAnsi="Helvetica" w:cs="Helvetica" w:eastAsia="Helvetica"/>
+          <w:b/>
+          <w:color w:val="000000"/>
+        </w:rPr>
+        <w:t>La sécurité ne peut pas encore être jugée.</w:t>
+      </w:r>
+      <w:r>
+        <w:rPr>
+          <w:rFonts w:ascii="Helvetica" w:hAnsi="Helvetica" w:cs="Helvetica" w:eastAsia="Helvetica"/>
+          <w:color w:val="000000"/>
+        </w:rPr>
+        <w:t xml:space="preserve"> Il manque la décision du ministre qui fixe, en Côte d'Ivoire, les placements autorisés, les relevés du dépôt à terme et du fonds, et les décisions du Conseil d'administration qui ont autorisé ces placements.</w:t>
+      </w:r>
+    </w:p>
+    <w:p>
+      <w:pPr>
+        <w:pStyle w:val="Heading3"/>
+      </w:pPr>
+      <w:r>
+        <w:t>Analyses statistiques, provision du personnel et réserve générale</w:t>
+      </w:r>
+    </w:p>
+    <w:p>
+      <w:pPr/>
+      <w:r>
+        <w:rPr>
+          <w:rFonts w:ascii="Helvetica" w:hAnsi="Helvetica" w:cs="Helvetica" w:eastAsia="Helvetica"/>
+          <w:b/>
+          <w:color w:val="000000"/>
+        </w:rPr>
+        <w:t>Les analyses statistiques complémentaires décrivent le comportement de la population couverte.</w:t>
+      </w:r>
+      <w:r>
+        <w:rPr>
+          <w:rFonts w:ascii="Helvetica" w:hAnsi="Helvetica" w:cs="Helvetica" w:eastAsia="Helvetica"/>
+          <w:color w:val="000000"/>
+        </w:rPr>
+        <w:t xml:space="preserve"> Exemples : combien de policiers décèdent chaque année, combien coûte une année de soins selon l'année où ils ont eu lieu, en combien de temps une facture est payée. Elles demandent les dates de naissance et les dossiers de prestations, non transmis.</w:t>
+      </w:r>
+    </w:p>
+    <w:p>
+      <w:pPr/>
+      <w:r>
+        <w:rPr>
+          <w:rFonts w:ascii="Helvetica" w:hAnsi="Helvetica" w:cs="Helvetica" w:eastAsia="Helvetica"/>
+          <w:b/>
+          <w:color w:val="000000"/>
+        </w:rPr>
+        <w:t>La provision du personnel est la somme que le FPPN doit réserver pour l'indemnité de départ à la retraite de ses propres salariés.</w:t>
+      </w:r>
+      <w:r>
+        <w:rPr>
+          <w:rFonts w:ascii="Helvetica" w:hAnsi="Helvetica" w:cs="Helvetica" w:eastAsia="Helvetica"/>
+          <w:color w:val="000000"/>
+        </w:rPr>
+        <w:t xml:space="preserve"> Le barème est connu : 30 % à 40 % d'un mois de salaire par année d'ancienneté (décret n° 2017-210). Elle ne vise que le personnel civil. Le calcul attend le fichier du personnel qui distingue civils et policiers.</w:t>
+      </w:r>
+    </w:p>
+    <w:p>
+      <w:pPr/>
+      <w:r>
+        <w:rPr>
+          <w:rFonts w:ascii="Helvetica" w:hAnsi="Helvetica" w:cs="Helvetica" w:eastAsia="Helvetica"/>
+          <w:b/>
+          <w:color w:val="000000"/>
+        </w:rPr>
+        <w:t>Enfin, les chiffres du 31/08/2026 sont provisoires.</w:t>
+      </w:r>
+      <w:r>
+        <w:rPr>
+          <w:rFonts w:ascii="Helvetica" w:hAnsi="Helvetica" w:cs="Helvetica" w:eastAsia="Helvetica"/>
+          <w:color w:val="000000"/>
+        </w:rPr>
+        <w:t xml:space="preserve"> La comptabilité de 2026 couvre huit mois et n'est pas arrêtée, et les fichiers de précomptes de 2020 à 2022 manquent. Les conclusions pourront être affinées à la clôture et à réception de ces fichiers.</w:t>
+      </w:r>
+    </w:p>
+    <w:p>
+      <w:pPr>
         <w:pStyle w:val="Heading1"/>
         <w:spacing w:before="100" w:after="100"/>
         <w:sectPr>

</xml_diff>